<commit_message>
Clarify timestamp wording - v1.0.1
</commit_message>
<xml_diff>
--- a/research-note-001.docx
+++ b/research-note-001.docx
@@ -28,7 +28,7 @@
     </w:p>
     <w:p>
       <w:r>
-        <w:t>RESEARCH NOTE 001 · 14 SEPTEMBER 2026 · VERSION 1.0</w:t>
+        <w:t>RESEARCH NOTE 001 · 14 SEPTEMBER 2026 · VERSION 1.0.1</w:t>
       </w:r>
     </w:p>
     <w:p>
@@ -559,7 +559,7 @@
     </w:p>
     <w:p>
       <w:r>
-        <w:t>Prevent substitution between measurement and consumption through mechanisms appropriate to the environment, such as immutable snapshots or evaluating the same captured bytes. Authenticate the recorder and verify its claims under an explicit trust model. A timestamp orders a claim; a signature attributes a claim; neither alone proves actual consumption.</w:t>
+        <w:t>Prevent substitution between measurement and consumption through mechanisms appropriate to the environment, such as immutable snapshots or evaluating the same captured bytes. Authenticate the recorder and verify its claims under an explicit trust model. A timestamp records a claimed time; a signature attributes a claim. Neither alone proves actual consumption or the order of events.</w:t>
       </w:r>
     </w:p>
     <w:p>
@@ -1189,7 +1189,7 @@
       <w:rPr>
         <w:sz w:val="16"/>
       </w:rPr>
-      <w:t xml:space="preserve">Version 1.0  ·  </w:t>
+      <w:t xml:space="preserve">Version 1.0.1  ·  </w:t>
     </w:r>
     <w:fldSimple w:instr="PAGE"/>
   </w:p>

</xml_diff>